<commit_message>
feature: clear comment and code unused
</commit_message>
<xml_diff>
--- a/outputs/eda/EDA_Report_ABSA_VLSP2018.docx
+++ b/outputs/eda/EDA_Report_ABSA_VLSP2018.docx
@@ -6359,7 +6359,6 @@
               <w:rPr>
                 <w:sz w:val="20"/>
               </w:rPr>
-              <w:t>concat_4_layers theo SOTA ds4v IEEE 2022</w:t>
             </w:r>
           </w:p>
         </w:tc>
@@ -6372,7 +6371,7 @@
         <w:jc w:val="left"/>
       </w:pPr>
       <w:r>
-        <w:t>8. Kết luận &amp; Định hướng Tuần 2</w:t>
+        <w:t>8. Kết luận &amp; Định hướng Phase PhoBERT</w:t>
       </w:r>
     </w:p>
     <w:p>
@@ -6447,24 +6446,6 @@
         <w:t>VnCoreNLP không available → fallback underthesea. → Xem xét cài Java 8+ và VnCoreNLP để đạt F1 tốt hơn ~1-2%.</w:t>
       </w:r>
     </w:p>
-    <w:p>
-      <w:pPr>
-        <w:pStyle w:val="ListBullet"/>
-      </w:pPr>
-      <w:r>
-        <w:rPr>
-          <w:b/>
-          <w:sz w:val="20"/>
-        </w:rPr>
-        <w:t xml:space="preserve">RARE_ASPECTS cần cập nhật: </w:t>
-      </w:r>
-      <w:r>
-        <w:rPr>
-          <w:sz w:val="20"/>
-        </w:rPr>
-        <w:t>Thực tế còn FACILITIES#PRICES, FOOD&amp;DRINKS#MISCELLANEOUS, ROOMS#MISCELLANEOUS cũng &lt; 100 mẫu. → Cập nhật constants.py.</w:t>
-      </w:r>
-    </w:p>
     <w:p/>
     <w:p>
       <w:r>
@@ -6472,7 +6453,7 @@
           <w:b w:val="0"/>
           <w:sz w:val="22"/>
         </w:rPr>
-        <w:t>Tuần 2: Fine-tune PhoBERT (vinai/phobert-base) với multi-task learning — 34 classification heads song song, weighted loss, warmup + linear decay scheduling.</w:t>
+        <w:t>Phase PhoBERT: Fine-tune PhoBERT (vinai/phobert-base) với multi-task learning — 34 classification heads song song, weighted loss, warmup + linear decay scheduling.</w:t>
       </w:r>
     </w:p>
     <w:sectPr>

</xml_diff>